<commit_message>
feat(bios): cosmetic fixes for 8 more entries; add CHANGELOG.md
New transforms in scripts/bios-transforms.ts cover:
- Black-ER / Chan-M / Eichhoff-JJ / Orr-JB / Pastizzi-D — insert missing nationality demonyms so the world-countries detector can match.
- Wyndham-White — restructure roles so each role carries "of the GATT (GATT)" with year spans in the standard trailing position.
- Phelan — add "of the International Labour Organization (ILO)" to the second role so the parser keeps the org/abbr.
- Rey — replace ", then" connector with " and " so the second role's chunk doesn't keep "then " as part of its title.

generate-diffs.ts now also emits bios-diffs/CHANGELOG.md as a single rollup of every applied edit. PARSING_KNOWN_ISSUES.md is trimmed to the residuals after these fixes.
</commit_message>
<xml_diff>
--- a/src/content/bios-diffs/Bonnet-H 2024 (track-changes).docx
+++ b/src/content/bios-diffs/Bonnet-H 2024 (track-changes).docx
@@ -11,7 +11,7 @@
           <w:color w:val="000000" w:themeColor="text1"/>
         </w:rPr>
       </w:pPr>
-      <w:del w:id="1000" w:author="IO BIO parser" w:date="2026-05-18T08:29:42Z">
+      <w:del w:id="1000" w:author="IO BIO parser" w:date="2026-05-18T08:57:46Z">
         <w:r>
           <w:rPr>
             <w:b/>
@@ -20,7 +20,7 @@
           <w:delText xml:space="preserve">BONNET, Basile Louis Jos</w:delText>
         </w:r>
       </w:del>
-      <w:del w:id="1000" w:author="IO BIO parser" w:date="2026-05-18T08:29:42Z">
+      <w:del w:id="1000" w:author="IO BIO parser" w:date="2026-05-18T08:57:46Z">
         <w:r>
           <w:rPr>
             <w:b/>
@@ -29,7 +29,7 @@
           <w:delText xml:space="preserve">ep</w:delText>
         </w:r>
       </w:del>
-      <w:del w:id="1000" w:author="IO BIO parser" w:date="2026-05-18T08:29:42Z">
+      <w:del w:id="1000" w:author="IO BIO parser" w:date="2026-05-18T08:57:46Z">
         <w:r>
           <w:rPr>
             <w:b/>
@@ -38,7 +38,7 @@
           <w:delText xml:space="preserve">h Henri (known as Henri Bonnet), French diplomat and </w:delText>
         </w:r>
       </w:del>
-      <w:del w:id="1000" w:author="IO BIO parser" w:date="2026-05-18T08:29:42Z">
+      <w:del w:id="1000" w:author="IO BIO parser" w:date="2026-05-18T08:57:46Z">
         <w:r>
           <w:rPr>
             <w:b/>
@@ -47,7 +47,7 @@
           <w:delText xml:space="preserve">second </w:delText>
         </w:r>
       </w:del>
-      <w:del w:id="1000" w:author="IO BIO parser" w:date="2026-05-18T08:29:42Z">
+      <w:del w:id="1000" w:author="IO BIO parser" w:date="2026-05-18T08:57:46Z">
         <w:r>
           <w:rPr>
             <w:b/>
@@ -57,7 +57,7 @@
           <w:delText xml:space="preserve">Director of the International Institute of Intellectual Cooperation </w:delText>
         </w:r>
       </w:del>
-      <w:del w:id="1000" w:author="IO BIO parser" w:date="2026-05-18T08:29:42Z">
+      <w:del w:id="1000" w:author="IO BIO parser" w:date="2026-05-18T08:57:46Z">
         <w:r>
           <w:rPr>
             <w:b/>
@@ -67,7 +67,7 @@
           <w:delText xml:space="preserve">(IIIC) </w:delText>
         </w:r>
       </w:del>
-      <w:del w:id="1000" w:author="IO BIO parser" w:date="2026-05-18T08:29:42Z">
+      <w:del w:id="1000" w:author="IO BIO parser" w:date="2026-05-18T08:57:46Z">
         <w:r>
           <w:rPr>
             <w:b/>
@@ -77,7 +77,7 @@
           <w:delText xml:space="preserve">1931-1940</w:delText>
         </w:r>
       </w:del>
-      <w:del w:id="1000" w:author="IO BIO parser" w:date="2026-05-18T08:29:42Z">
+      <w:del w:id="1000" w:author="IO BIO parser" w:date="2026-05-18T08:57:46Z">
         <w:r>
           <w:rPr>
             <w:b/>
@@ -87,7 +87,7 @@
           <w:delText xml:space="preserve">,</w:delText>
         </w:r>
       </w:del>
-      <w:del w:id="1000" w:author="IO BIO parser" w:date="2026-05-18T08:29:42Z">
+      <w:del w:id="1000" w:author="IO BIO parser" w:date="2026-05-18T08:57:46Z">
         <w:r>
           <w:rPr>
             <w:b/>
@@ -97,7 +97,7 @@
           <w:delText xml:space="preserve"> was the son of J</w:delText>
         </w:r>
       </w:del>
-      <w:del w:id="1000" w:author="IO BIO parser" w:date="2026-05-18T08:29:42Z">
+      <w:del w:id="1000" w:author="IO BIO parser" w:date="2026-05-18T08:57:46Z">
         <w:r>
           <w:rPr>
             <w:b/>
@@ -107,7 +107,7 @@
           <w:delText xml:space="preserve">ules Theobald</w:delText>
         </w:r>
       </w:del>
-      <w:del w:id="1000" w:author="IO BIO parser" w:date="2026-05-18T08:29:42Z">
+      <w:del w:id="1000" w:author="IO BIO parser" w:date="2026-05-18T08:57:46Z">
         <w:r>
           <w:rPr>
             <w:b/>
@@ -117,7 +117,7 @@
           <w:delText xml:space="preserve"> Bonnet</w:delText>
         </w:r>
       </w:del>
-      <w:del w:id="1000" w:author="IO BIO parser" w:date="2026-05-18T08:29:42Z">
+      <w:del w:id="1000" w:author="IO BIO parser" w:date="2026-05-18T08:57:46Z">
         <w:r>
           <w:rPr>
             <w:b/>
@@ -127,7 +127,7 @@
           <w:delText xml:space="preserve">, </w:delText>
         </w:r>
       </w:del>
-      <w:del w:id="1000" w:author="IO BIO parser" w:date="2026-05-18T08:29:42Z">
+      <w:del w:id="1000" w:author="IO BIO parser" w:date="2026-05-18T08:57:46Z">
         <w:r>
           <w:rPr>
             <w:b/>
@@ -137,7 +137,7 @@
           <w:delText xml:space="preserve">collector</w:delText>
         </w:r>
       </w:del>
-      <w:del w:id="1000" w:author="IO BIO parser" w:date="2026-05-18T08:29:42Z">
+      <w:del w:id="1000" w:author="IO BIO parser" w:date="2026-05-18T08:57:46Z">
         <w:r>
           <w:rPr>
             <w:b/>
@@ -147,7 +147,7 @@
           <w:delText xml:space="preserve"> of indirect taxes</w:delText>
         </w:r>
       </w:del>
-      <w:del w:id="1000" w:author="IO BIO parser" w:date="2026-05-18T08:29:42Z">
+      <w:del w:id="1000" w:author="IO BIO parser" w:date="2026-05-18T08:57:46Z">
         <w:r>
           <w:rPr>
             <w:b/>
@@ -157,7 +157,7 @@
           <w:delText xml:space="preserve">,</w:delText>
         </w:r>
       </w:del>
-      <w:del w:id="1000" w:author="IO BIO parser" w:date="2026-05-18T08:29:42Z">
+      <w:del w:id="1000" w:author="IO BIO parser" w:date="2026-05-18T08:57:46Z">
         <w:r>
           <w:rPr>
             <w:b/>
@@ -167,7 +167,7 @@
           <w:delText xml:space="preserve"> and Marie Thérèse Lascoux. He was born 26 May 1888 in Ch</w:delText>
         </w:r>
       </w:del>
-      <w:del w:id="1000" w:author="IO BIO parser" w:date="2026-05-18T08:29:42Z">
+      <w:del w:id="1000" w:author="IO BIO parser" w:date="2026-05-18T08:57:46Z">
         <w:r>
           <w:rPr>
             <w:rFonts w:cs="Times New Roman"/>
@@ -178,7 +178,7 @@
           <w:delText xml:space="preserve">â</w:delText>
         </w:r>
       </w:del>
-      <w:del w:id="1000" w:author="IO BIO parser" w:date="2026-05-18T08:29:42Z">
+      <w:del w:id="1000" w:author="IO BIO parser" w:date="2026-05-18T08:57:46Z">
         <w:r>
           <w:rPr>
             <w:b/>
@@ -188,7 +188,7 @@
           <w:delText xml:space="preserve">teauponsac</w:delText>
         </w:r>
       </w:del>
-      <w:del w:id="1000" w:author="IO BIO parser" w:date="2026-05-18T08:29:42Z">
+      <w:del w:id="1000" w:author="IO BIO parser" w:date="2026-05-18T08:57:46Z">
         <w:r>
           <w:rPr>
             <w:b/>
@@ -198,7 +198,7 @@
           <w:delText xml:space="preserve"> </w:delText>
         </w:r>
       </w:del>
-      <w:del w:id="1000" w:author="IO BIO parser" w:date="2026-05-18T08:29:42Z">
+      <w:del w:id="1000" w:author="IO BIO parser" w:date="2026-05-18T08:57:46Z">
         <w:r>
           <w:rPr>
             <w:b/>
@@ -208,7 +208,7 @@
           <w:delText xml:space="preserve">and passed away 25 October 1978 in Paris, France.</w:delText>
         </w:r>
       </w:del>
-      <w:del w:id="1000" w:author="IO BIO parser" w:date="2026-05-18T08:29:42Z">
+      <w:del w:id="1000" w:author="IO BIO parser" w:date="2026-05-18T08:57:46Z">
         <w:r>
           <w:rPr>
             <w:b/>
@@ -218,7 +218,7 @@
           <w:delText xml:space="preserve"> On </w:delText>
         </w:r>
       </w:del>
-      <w:del w:id="1000" w:author="IO BIO parser" w:date="2026-05-18T08:29:42Z">
+      <w:del w:id="1000" w:author="IO BIO parser" w:date="2026-05-18T08:57:46Z">
         <w:r>
           <w:rPr>
             <w:b/>
@@ -228,7 +228,7 @@
           <w:delText xml:space="preserve">27 August 1932</w:delText>
         </w:r>
       </w:del>
-      <w:del w:id="1000" w:author="IO BIO parser" w:date="2026-05-18T08:29:42Z">
+      <w:del w:id="1000" w:author="IO BIO parser" w:date="2026-05-18T08:57:46Z">
         <w:r>
           <w:rPr>
             <w:b/>
@@ -238,7 +238,7 @@
           <w:delText xml:space="preserve"> he married Hellé Zervoudaki.</w:delText>
         </w:r>
       </w:del>
-      <w:ins w:id="1001" w:author="IO BIO parser" w:date="2026-05-18T08:29:42Z">
+      <w:ins w:id="1001" w:author="IO BIO parser" w:date="2026-05-18T08:57:46Z">
         <w:r>
           <w:t xml:space="preserve">BONNET, Basile Louis Joseph Henri (known as Henri Bonnet), French diplomat and second Director of the International Institute of Intellectual Cooperation (IIIC) 1931-1940, was born 26 May 1888 in Châteauponsac and passed away 25 October 1978 in Paris, France. He was the son of Jules Theobald Bonnet, collector of indirect taxes, and Marie Thérèse Lascoux. On 27 August 1932 he married Hellé Zervoudaki.</w:t>
         </w:r>

</xml_diff>